<commit_message>
Fix cross-platform issues found during Windows compatibility testing
- format all amounts through UITheme.money() so a comma-decimal regional
  setting no longer breaks View Bill and View Order Details
- use one line separator in the bill so the saved text file is consistent
  on Windows
- keep every window inside the screen when display scaling is on
- keep the button colours on look and feels that paint buttons themselves
- update the report and the study guides to match
</commit_message>
<xml_diff>
--- a/docs/BCA_Project_Report_Food_Ordering_System.docx
+++ b/docs/BCA_Project_Report_Food_Ordering_System.docx
@@ -17648,7 +17648,7 @@
       <w:r>
         <w:drawing>
           <wp:inline xmlns:a="http://schemas.openxmlformats.org/drawingml/2006/main" xmlns:pic="http://schemas.openxmlformats.org/drawingml/2006/picture">
-            <wp:extent cx="4412361" cy="3140329"/>
+            <wp:extent cx="4412361" cy="2797661"/>
             <wp:docPr id="26" name="Picture 26"/>
             <wp:cNvGraphicFramePr>
               <a:graphicFrameLocks noChangeAspect="1"/>
@@ -17669,7 +17669,7 @@
                   <pic:spPr>
                     <a:xfrm>
                       <a:off x="0" y="0"/>
-                      <a:ext cx="4412361" cy="3140329"/>
+                      <a:ext cx="4412361" cy="2797661"/>
                     </a:xfrm>
                     <a:prstGeom prst="rect"/>
                   </pic:spPr>
@@ -25336,7 +25336,7 @@
           <w:i w:val="0"/>
           <w:sz w:val="22"/>
         </w:rPr>
-        <w:t>Three problems were found while testing the finished application and all three were corrected.</w:t>
+        <w:t>Six problems were found while testing the finished application and all six were corrected. The last three were found while checking that the project also behaves correctly on a Windows computer.</w:t>
       </w:r>
     </w:p>
     <w:p>
@@ -25400,6 +25400,69 @@
           <w:sz w:val="22"/>
         </w:rPr>
         <w:t>The quantity box accepted a very large number such as 2147483647, which produced a total that did not fit the total_amount column. The quantity is now limited to a whole number from 1 to 100 and the price of a dish to at most 99999.99.</w:t>
+      </w:r>
+    </w:p>
+    <w:p>
+      <w:pPr>
+        <w:spacing w:after="40" w:line="254" w:lineRule="auto"/>
+        <w:ind w:left="504"/>
+      </w:pPr>
+      <w:r>
+        <w:rPr>
+          <w:rFonts w:ascii="Times New Roman" w:hAnsi="Times New Roman"/>
+          <w:b/>
+          <w:sz w:val="22"/>
+        </w:rPr>
+        <w:t xml:space="preserve">4.  </w:t>
+      </w:r>
+      <w:r>
+        <w:rPr>
+          <w:rFonts w:ascii="Times New Roman" w:hAnsi="Times New Roman"/>
+          <w:sz w:val="22"/>
+        </w:rPr>
+        <w:t>On a computer whose regional settings write decimals with a comma, the amount shown in the order tables was 460,00 instead of 460.00, and the View Bill and View Order Details buttons then failed to open the bill. All amounts are now formatted through one method, UITheme.money(), which always uses a dot.</w:t>
+      </w:r>
+    </w:p>
+    <w:p>
+      <w:pPr>
+        <w:spacing w:after="40" w:line="254" w:lineRule="auto"/>
+        <w:ind w:left="504"/>
+      </w:pPr>
+      <w:r>
+        <w:rPr>
+          <w:rFonts w:ascii="Times New Roman" w:hAnsi="Times New Roman"/>
+          <w:b/>
+          <w:sz w:val="22"/>
+        </w:rPr>
+        <w:t xml:space="preserve">5.  </w:t>
+      </w:r>
+      <w:r>
+        <w:rPr>
+          <w:rFonts w:ascii="Times New Roman" w:hAnsi="Times New Roman"/>
+          <w:sz w:val="22"/>
+        </w:rPr>
+        <w:t>The saved bill file mixed two kinds of line ending on Windows. BillDialog now uses one line separator taken from the system for every line, so the text file opens correctly in Notepad as well as in a Linux editor.</w:t>
+      </w:r>
+    </w:p>
+    <w:p>
+      <w:pPr>
+        <w:spacing w:after="40" w:line="254" w:lineRule="auto"/>
+        <w:ind w:left="504"/>
+      </w:pPr>
+      <w:r>
+        <w:rPr>
+          <w:rFonts w:ascii="Times New Roman" w:hAnsi="Times New Roman"/>
+          <w:b/>
+          <w:sz w:val="22"/>
+        </w:rPr>
+        <w:t xml:space="preserve">6.  </w:t>
+      </w:r>
+      <w:r>
+        <w:rPr>
+          <w:rFonts w:ascii="Times New Roman" w:hAnsi="Times New Roman"/>
+          <w:sz w:val="22"/>
+        </w:rPr>
+        <w:t>On a laptop screen with Windows display scaling switched on, the two dashboard windows were slightly taller than the screen and the Logout button could fall below the visible area. Every window is now opened through UITheme.setSizeWithinScreen(), which never makes a window larger than the screen.</w:t>
       </w:r>
     </w:p>
     <w:p>

</xml_diff>